<commit_message>
docs: fichas mais fundas da Clarice, da Diana, do Zane, do Baltazar e do Carlos
Clarice controladora, Diana ativa e investigativa, Zane frio e
calculista com o arco de aprender a se importar, Baltazar só em rastros
e cartas, Carlos enlouquecido pelo isolamento e com medo do presente.
Gabriel e o resumo acompanham.

Co-Authored-By: Claude Opus 5.5 <noreply@anthropic.com>
</commit_message>
<xml_diff>
--- a/docs/historia/personagens/baltazar.docx
+++ b/docs/historia/personagens/baltazar.docx
@@ -431,7 +431,23 @@
                 <w:sz w:val="19"/>
                 <w:szCs w:val="19"/>
               </w:rPr>
-              <w:t xml:space="preserve">Em definição. O acampamento e o diário estão na Biblioteca; o esconderijo e o primeiro encontro, no Labirinto.</w:t>
+              <w:t xml:space="preserve">Em definição. </w:t>
+            </w:r>
+            <w:r>
+              <w:rPr>
+                <w:b/>
+                <w:bCs/>
+                <w:sz w:val="19"/>
+                <w:szCs w:val="19"/>
+              </w:rPr>
+              <w:t xml:space="preserve">Não aparece em pessoa:</w:t>
+            </w:r>
+            <w:r>
+              <w:rPr>
+                <w:sz w:val="19"/>
+                <w:szCs w:val="19"/>
+              </w:rPr>
+              <w:t xml:space="preserve"> existe só pelos rastros (o acampamento e o diário na Biblioteca, a sala vazia no Labirinto, cartas e pistas em cada fase).</w:t>
             </w:r>
           </w:p>
         </w:tc>
@@ -776,7 +792,23 @@
                 <w:sz w:val="19"/>
                 <w:szCs w:val="19"/>
               </w:rPr>
-              <w:t xml:space="preserve"> entre as raízes da árvore: luneta rachada, vela, diário e um robô desmontado peça por peça. Na última página escreve "Hei de seguir a luz até onde ella nasce": seguiu a luz, desceu ao subsolo e se escondeu no </w:t>
+              <w:t xml:space="preserve"> entre as raízes da árvore: luneta rachada, vela, diário e um robô desmontado peça por peça. Na última página escreve "Hei de seguir a luz até onde ella nasce", e seguiu: </w:t>
+            </w:r>
+            <w:r>
+              <w:rPr>
+                <w:b/>
+                <w:bCs/>
+                <w:sz w:val="19"/>
+                <w:szCs w:val="19"/>
+              </w:rPr>
+              <w:t xml:space="preserve">fez o mesmo caminho que o Gabriel faz, fase por fase</w:t>
+            </w:r>
+            <w:r>
+              <w:rPr>
+                <w:sz w:val="19"/>
+                <w:szCs w:val="19"/>
+              </w:rPr>
+              <w:t xml:space="preserve">, deixando rastros por onde passou. Morou um tempo numa sala do </w:t>
             </w:r>
             <w:r>
               <w:rPr>
@@ -792,39 +824,55 @@
                 <w:sz w:val="19"/>
                 <w:szCs w:val="19"/>
               </w:rPr>
-              <w:t xml:space="preserve">, numa sala atrás de um painel solto que os robôs nunca acharam. Em 3026, teve dificuldade com o rádio e com a tecnologia, ficou com </w:t>
-            </w:r>
-            <w:r>
-              <w:rPr>
-                <w:b/>
-                <w:bCs/>
-                <w:sz w:val="19"/>
-                <w:szCs w:val="19"/>
-              </w:rPr>
-              <w:t xml:space="preserve">medo</w:t>
-            </w:r>
-            <w:r>
-              <w:rPr>
-                <w:sz w:val="19"/>
-                <w:szCs w:val="19"/>
-              </w:rPr>
-              <w:t xml:space="preserve"> e </w:t>
-            </w:r>
-            <w:r>
-              <w:rPr>
-                <w:b/>
-                <w:bCs/>
-                <w:sz w:val="19"/>
-                <w:szCs w:val="19"/>
-              </w:rPr>
-              <w:t xml:space="preserve">se isolou</w:t>
-            </w:r>
-            <w:r>
-              <w:rPr>
-                <w:sz w:val="19"/>
-                <w:szCs w:val="19"/>
-              </w:rPr>
-              <w:t xml:space="preserve">: ouve as vozes nas "caixas que falam" e não responde, e não está na frequência de rádio do grupo. Gabriel o encontra no Labirinto.</w:t>
+              <w:t xml:space="preserve">, atrás de um painel solto que os robôs nunca acharam. A trilha termina na </w:t>
+            </w:r>
+            <w:r>
+              <w:rPr>
+                <w:b/>
+                <w:bCs/>
+                <w:sz w:val="19"/>
+                <w:szCs w:val="19"/>
+              </w:rPr>
+              <w:t xml:space="preserve">Âncora</w:t>
+            </w:r>
+            <w:r>
+              <w:rPr>
+                <w:sz w:val="19"/>
+                <w:szCs w:val="19"/>
+              </w:rPr>
+              <w:t xml:space="preserve">, onde a luz nasce, e ali ele </w:t>
+            </w:r>
+            <w:r>
+              <w:rPr>
+                <w:b/>
+                <w:bCs/>
+                <w:sz w:val="19"/>
+                <w:szCs w:val="19"/>
+              </w:rPr>
+              <w:t xml:space="preserve">desaparece</w:t>
+            </w:r>
+            <w:r>
+              <w:rPr>
+                <w:sz w:val="19"/>
+                <w:szCs w:val="19"/>
+              </w:rPr>
+              <w:t xml:space="preserve">. O que aconteceu com ele fica </w:t>
+            </w:r>
+            <w:r>
+              <w:rPr>
+                <w:b/>
+                <w:bCs/>
+                <w:sz w:val="19"/>
+                <w:szCs w:val="19"/>
+              </w:rPr>
+              <w:t xml:space="preserve">em aberto até o fim do jogo</w:t>
+            </w:r>
+            <w:r>
+              <w:rPr>
+                <w:sz w:val="19"/>
+                <w:szCs w:val="19"/>
+              </w:rPr>
+              <w:t xml:space="preserve">. Teve dificuldade com o rádio e com a tecnologia de 3026, ficou com medo e se isolou: ouvia as vozes nas "caixas que falam" e não respondia, e nunca esteve na frequência do grupo. Gabriel nunca o encontra.</w:t>
             </w:r>
           </w:p>
         </w:tc>
@@ -1220,23 +1268,7 @@
                 <w:sz w:val="19"/>
                 <w:szCs w:val="19"/>
               </w:rPr>
-              <w:t xml:space="preserve">entender o que vê. Para ele, observar o céu é uma forma de rezar. Por isso, em 3026, </w:t>
-            </w:r>
-            <w:r>
-              <w:rPr>
-                <w:b/>
-                <w:bCs/>
-                <w:sz w:val="19"/>
-                <w:szCs w:val="19"/>
-              </w:rPr>
-              <w:t xml:space="preserve">quer ficar</w:t>
-            </w:r>
-            <w:r>
-              <w:rPr>
-                <w:sz w:val="19"/>
-                <w:szCs w:val="19"/>
-              </w:rPr>
-              <w:t xml:space="preserve">: tudo ali é um milagre a estudar.</w:t>
+              <w:t xml:space="preserve">entender o que vê. Para ele, observar o céu é uma forma de rezar. Por isso seguiu a luz até onde ela nasce.</w:t>
             </w:r>
           </w:p>
         </w:tc>
@@ -1443,23 +1475,39 @@
                 <w:sz w:val="19"/>
                 <w:szCs w:val="19"/>
               </w:rPr>
-              <w:t xml:space="preserve">do "Juízo Final" à compreensão. Ao saber que Gabriel é descendente dele, fica protetor e orgulhoso, com um humor terno ("meu neto de mil anos"). No fim, quer ficar em 3026, mas </w:t>
-            </w:r>
-            <w:r>
-              <w:rPr>
-                <w:b/>
-                <w:bCs/>
-                <w:sz w:val="19"/>
-                <w:szCs w:val="19"/>
-              </w:rPr>
-              <w:t xml:space="preserve">precisa voltar</w:t>
-            </w:r>
-            <w:r>
-              <w:rPr>
-                <w:sz w:val="19"/>
-                <w:szCs w:val="19"/>
-              </w:rPr>
-              <w:t xml:space="preserve">, ou a família de Gabriel não existe. Gabriel tem que convencer o próprio antepassado a ir embora.</w:t>
+              <w:t xml:space="preserve">contado </w:t>
+            </w:r>
+            <w:r>
+              <w:rPr>
+                <w:b/>
+                <w:bCs/>
+                <w:sz w:val="19"/>
+                <w:szCs w:val="19"/>
+              </w:rPr>
+              <w:t xml:space="preserve">só pelo papel</w:t>
+            </w:r>
+            <w:r>
+              <w:rPr>
+                <w:sz w:val="19"/>
+                <w:szCs w:val="19"/>
+              </w:rPr>
+              <w:t xml:space="preserve">: do "Juízo Final" (o medo, na Biblioteca) à curiosidade (o robô desmontado e a chapa com o céu, no Labirinto) e à </w:t>
+            </w:r>
+            <w:r>
+              <w:rPr>
+                <w:b/>
+                <w:bCs/>
+                <w:sz w:val="19"/>
+                <w:szCs w:val="19"/>
+              </w:rPr>
+              <w:t xml:space="preserve">coragem de entrar na luz</w:t>
+            </w:r>
+            <w:r>
+              <w:rPr>
+                <w:sz w:val="19"/>
+                <w:szCs w:val="19"/>
+              </w:rPr>
+              <w:t xml:space="preserve">, no fim da trilha.</w:t>
             </w:r>
           </w:p>
         </w:tc>
@@ -1635,74 +1683,7 @@
                 <w:sz w:val="19"/>
                 <w:szCs w:val="19"/>
               </w:rPr>
-              <w:t xml:space="preserve">Família descoberta. No fim, é Gabriel quem o convence a voltar para 1750</w:t>
-            </w:r>
-          </w:p>
-        </w:tc>
-      </w:tr>
-      <w:tr>
-        <w:trPr>
-          <w:cantSplit/>
-        </w:trPr>
-        <w:tc>
-          <w:tcPr>
-            <w:tcW w:type="dxa" w:w="2500"/>
-            <w:tcBorders>
-              <w:top w:val="single" w:color="BFC9D1" w:sz="4"/>
-              <w:left w:val="single" w:color="BFC9D1" w:sz="4"/>
-              <w:bottom w:val="single" w:color="BFC9D1" w:sz="4"/>
-              <w:right w:val="single" w:color="BFC9D1" w:sz="4"/>
-            </w:tcBorders>
-            <w:tcMar>
-              <w:top w:type="dxa" w:w="80"/>
-              <w:left w:type="dxa" w:w="120"/>
-              <w:bottom w:type="dxa" w:w="80"/>
-              <w:right w:type="dxa" w:w="120"/>
-            </w:tcMar>
-            <w:vAlign w:val="top"/>
-          </w:tcPr>
-          <w:p>
-            <w:pPr>
-              <w:spacing w:before="0" w:after="40"/>
-            </w:pPr>
-            <w:r>
-              <w:rPr>
-                <w:color w:val="2A7F8E"/>
-                <w:sz w:val="19"/>
-                <w:szCs w:val="19"/>
-                <w:u w:val="single"/>
-              </w:rPr>
-              <w:t xml:space="preserve">Zane</w:t>
-            </w:r>
-          </w:p>
-        </w:tc>
-        <w:tc>
-          <w:tcPr>
-            <w:tcW w:type="dxa" w:w="6526"/>
-            <w:tcBorders>
-              <w:top w:val="single" w:color="BFC9D1" w:sz="4"/>
-              <w:left w:val="single" w:color="BFC9D1" w:sz="4"/>
-              <w:bottom w:val="single" w:color="BFC9D1" w:sz="4"/>
-              <w:right w:val="single" w:color="BFC9D1" w:sz="4"/>
-            </w:tcBorders>
-            <w:tcMar>
-              <w:top w:type="dxa" w:w="80"/>
-              <w:left w:type="dxa" w:w="120"/>
-              <w:bottom w:type="dxa" w:w="80"/>
-              <w:right w:type="dxa" w:w="120"/>
-            </w:tcMar>
-            <w:vAlign w:val="top"/>
-          </w:tcPr>
-          <w:p>
-            <w:pPr>
-              <w:spacing w:before="0" w:after="40"/>
-            </w:pPr>
-            <w:r>
-              <w:rPr>
-                <w:sz w:val="19"/>
-                <w:szCs w:val="19"/>
-              </w:rPr>
-              <w:t xml:space="preserve">Os dois extremos do tempo: fé contra tecnologia, e ainda assim os dois mais curiosos do grupo</w:t>
+              <w:t xml:space="preserve">O descendente que segue os rastros dele sem saber, fase por fase, e nunca o encontra. Descobre o parentesco pelo anel desenhado numa carta</w:t>
             </w:r>
           </w:p>
         </w:tc>
@@ -1803,26 +1784,19 @@
             </w:pPr>
             <w:r>
               <w:rPr>
-                <w:sz w:val="19"/>
-                <w:szCs w:val="19"/>
-              </w:rPr>
-              <w:t xml:space="preserve">na Biblioteca, só o acampamento que ele deixou. Em pessoa, no </w:t>
-            </w:r>
-            <w:r>
-              <w:rPr>
-                <w:b/>
-                <w:bCs/>
-                <w:sz w:val="19"/>
-                <w:szCs w:val="19"/>
-              </w:rPr>
-              <w:t xml:space="preserve">Labirinto</w:t>
-            </w:r>
-            <w:r>
-              <w:rPr>
-                <w:sz w:val="19"/>
-                <w:szCs w:val="19"/>
-              </w:rPr>
-              <w:t xml:space="preserve">, no esconderijo dele.</w:t>
+                <w:b/>
+                <w:bCs/>
+                <w:sz w:val="19"/>
+                <w:szCs w:val="19"/>
+              </w:rPr>
+              <w:t xml:space="preserve">não aparece em pessoa</w:t>
+            </w:r>
+            <w:r>
+              <w:rPr>
+                <w:sz w:val="19"/>
+                <w:szCs w:val="19"/>
+              </w:rPr>
+              <w:t xml:space="preserve">. Só os rastros: o acampamento e o diário na Biblioteca, a sala vazia no Labirinto e pistas em cada fase, até a Âncora.</w:t>
             </w:r>
           </w:p>
         </w:tc>
@@ -1891,16 +1865,16 @@
                 <w:sz w:val="19"/>
                 <w:szCs w:val="19"/>
               </w:rPr>
-              <w:t xml:space="preserve">uma </w:t>
-            </w:r>
-            <w:r>
-              <w:rPr>
-                <w:b/>
-                <w:bCs/>
-                <w:sz w:val="19"/>
-                <w:szCs w:val="19"/>
-              </w:rPr>
-              <w:t xml:space="preserve">sala secreta no Labirinto</w:t>
+              <w:t xml:space="preserve">a sala onde ele morou, no </w:t>
+            </w:r>
+            <w:r>
+              <w:rPr>
+                <w:b/>
+                <w:bCs/>
+                <w:sz w:val="19"/>
+                <w:szCs w:val="19"/>
+              </w:rPr>
+              <w:t xml:space="preserve">Labirinto</w:t>
             </w:r>
             <w:r>
               <w:rPr>
@@ -1955,7 +1929,39 @@
                 <w:sz w:val="19"/>
                 <w:szCs w:val="19"/>
               </w:rPr>
-              <w:t xml:space="preserve"> (ele marcou assim a própria porta: "Cá embaixo não há céu, e eu sem céu me perco"). Dentro, a bagunça de quem mora ali: cama de panos verdes das cabines da Biblioteca com um cobertor vinho, um altar de caixa com velas e uma cruz de vergalhão amarrada com fita, livros da Biblioteca, um robô desmontado e peças espalhadas, e uma chapa de metal com o céu de casa riscado a giz. Os robôs não acham a sala: ela fica fora do grafo do labirinto.</w:t>
+              <w:t xml:space="preserve"> (ele marcou assim a própria porta: "Cá embaixo não há céu, e eu sem céu me perco"). Dentro, </w:t>
+            </w:r>
+            <w:r>
+              <w:rPr>
+                <w:b/>
+                <w:bCs/>
+                <w:sz w:val="19"/>
+                <w:szCs w:val="19"/>
+              </w:rPr>
+              <w:t xml:space="preserve">vazia</w:t>
+            </w:r>
+            <w:r>
+              <w:rPr>
+                <w:sz w:val="19"/>
+                <w:szCs w:val="19"/>
+              </w:rPr>
+              <w:t xml:space="preserve">, a bagunça de quem morou ali: cama de panos verdes das cabines da Biblioteca com um cobertor vinho, um altar de caixa com velas gastas e uma cruz de vergalhão amarrada com fita, livros da Biblioteca, um robô desmontado e peças espalhadas, uma chapa de metal com o céu de casa riscado a giz e uma </w:t>
+            </w:r>
+            <w:r>
+              <w:rPr>
+                <w:b/>
+                <w:bCs/>
+                <w:sz w:val="19"/>
+                <w:szCs w:val="19"/>
+              </w:rPr>
+              <w:t xml:space="preserve">carta</w:t>
+            </w:r>
+            <w:r>
+              <w:rPr>
+                <w:sz w:val="19"/>
+                <w:szCs w:val="19"/>
+              </w:rPr>
+              <w:t xml:space="preserve">. Os robôs não acham a sala: ela fica fora do grafo do labirinto.</w:t>
             </w:r>
           </w:p>
         </w:tc>
@@ -1994,7 +2000,7 @@
                 <w:sz w:val="19"/>
                 <w:szCs w:val="19"/>
               </w:rPr>
-              <w:t xml:space="preserve">Primeiro encontro</w:t>
+              <w:t xml:space="preserve">Rastros pelas fases</w:t>
             </w:r>
           </w:p>
         </w:tc>
@@ -2024,23 +2030,7 @@
                 <w:sz w:val="19"/>
                 <w:szCs w:val="19"/>
               </w:rPr>
-              <w:t xml:space="preserve">ao entrar, Gabriel dá de cara com ele. O Baltazar se assusta ("Vade retro, Satana!"), pergunta se é o fim do mundo, conta que seguiu a luz até o subsolo e </w:t>
-            </w:r>
-            <w:r>
-              <w:rPr>
-                <w:b/>
-                <w:bCs/>
-                <w:sz w:val="19"/>
-                <w:szCs w:val="19"/>
-              </w:rPr>
-              <w:t xml:space="preserve">não quer sair</w:t>
-            </w:r>
-            <w:r>
-              <w:rPr>
-                <w:sz w:val="19"/>
-                <w:szCs w:val="19"/>
-              </w:rPr>
-              <w:t xml:space="preserve">. Gabriel diz só o primeiro nome ("Como o Arcanjo"), e o parentesco não aparece. Nas visitas seguintes, ele repete o conselho do diário sobre os olhos dos robôs.</w:t>
+              <w:t xml:space="preserve">na Biblioteca, o acampamento e o diário; no Bloco de salas, estrelas riscadas numa lousa, no meio das contas de 3026 (o céu de casa, de memória); no Labirinto, a sala vazia e uma carta; no Centro de Convivência, uma página perdida do diário e cera de vela num canto escondido da praça; no Bunker, a sala de visitas do século XIX, onde ele dormiu porque ela parecia casa, e deixou o chapéu ou uma página; no D-Tec, o último rastro, perto da Âncora.</w:t>
             </w:r>
           </w:p>
         </w:tc>
@@ -2109,23 +2099,23 @@
                 <w:sz w:val="19"/>
                 <w:szCs w:val="19"/>
               </w:rPr>
-              <w:t xml:space="preserve">primeiro pelo </w:t>
-            </w:r>
-            <w:r>
-              <w:rPr>
-                <w:b/>
-                <w:bCs/>
-                <w:sz w:val="19"/>
-                <w:szCs w:val="19"/>
-              </w:rPr>
-              <w:t xml:space="preserve">diário</w:t>
-            </w:r>
-            <w:r>
-              <w:rPr>
-                <w:sz w:val="19"/>
-                <w:szCs w:val="19"/>
-              </w:rPr>
-              <w:t xml:space="preserve"> e pelo acampamento; depois em pessoa.</w:t>
+              <w:t xml:space="preserve">só pelo </w:t>
+            </w:r>
+            <w:r>
+              <w:rPr>
+                <w:b/>
+                <w:bCs/>
+                <w:sz w:val="19"/>
+                <w:szCs w:val="19"/>
+              </w:rPr>
+              <w:t xml:space="preserve">papel e pelo cenário</w:t>
+            </w:r>
+            <w:r>
+              <w:rPr>
+                <w:sz w:val="19"/>
+                <w:szCs w:val="19"/>
+              </w:rPr>
+              <w:t xml:space="preserve">: o diário, as cartas e os rastros em cada fase.</w:t>
             </w:r>
           </w:p>
         </w:tc>
@@ -2279,7 +2269,23 @@
                 <w:sz w:val="19"/>
                 <w:szCs w:val="19"/>
               </w:rPr>
-              <w:t xml:space="preserve">o mesmo anel que Gabriel tem gasto no inventário aparece novo no dedo do Baltazar. A comparação no inventário é como o jogador descobre o parentesco.</w:t>
+              <w:t xml:space="preserve">numa das </w:t>
+            </w:r>
+            <w:r>
+              <w:rPr>
+                <w:b/>
+                <w:bCs/>
+                <w:sz w:val="19"/>
+                <w:szCs w:val="19"/>
+              </w:rPr>
+              <w:t xml:space="preserve">cartas</w:t>
+            </w:r>
+            <w:r>
+              <w:rPr>
+                <w:sz w:val="19"/>
+                <w:szCs w:val="19"/>
+              </w:rPr>
+              <w:t xml:space="preserve">, ele desenha o anel que leva no dedo ("guardo o anel do pai, para lhe dar quando tornar"). O jogador compara o desenho com o anel gasto do Gabriel no inventário e descobre o parentesco. Fica a dúvida: se ele não voltou, como o Gabriel existe? A única prova de que ele voltou é o próprio Gabriel.</w:t>
             </w:r>
           </w:p>
         </w:tc>
@@ -2348,7 +2354,23 @@
                 <w:sz w:val="19"/>
                 <w:szCs w:val="19"/>
               </w:rPr>
-              <w:t xml:space="preserve">as estrelas: o céu é o único relógio que não muda, e é por ele que se acerta a data de volta de cada um.</w:t>
+              <w:t xml:space="preserve">as estrelas, pela </w:t>
+            </w:r>
+            <w:r>
+              <w:rPr>
+                <w:b/>
+                <w:bCs/>
+                <w:sz w:val="19"/>
+                <w:szCs w:val="19"/>
+              </w:rPr>
+              <w:t xml:space="preserve">chapa com o céu de casa</w:t>
+            </w:r>
+            <w:r>
+              <w:rPr>
+                <w:sz w:val="19"/>
+                <w:szCs w:val="19"/>
+              </w:rPr>
+              <w:t xml:space="preserve"> que ele deixou na sala do Labirinto: o céu é o único relógio que não muda, e é por ele que se acerta a data de volta de cada um. Ele não está lá para entregar: o grupo usa o que ele deixou.</w:t>
             </w:r>
           </w:p>
         </w:tc>
@@ -2469,7 +2491,23 @@
                 <w:sz w:val="19"/>
                 <w:szCs w:val="19"/>
               </w:rPr>
-              <w:t xml:space="preserve">). Papel amarelado, tinta marrom, desenhos a traço. Português arcaico, com latim.</w:t>
+              <w:t xml:space="preserve">) e </w:t>
+            </w:r>
+            <w:r>
+              <w:rPr>
+                <w:b/>
+                <w:bCs/>
+                <w:sz w:val="19"/>
+                <w:szCs w:val="19"/>
+              </w:rPr>
+              <w:t xml:space="preserve">cartas</w:t>
+            </w:r>
+            <w:r>
+              <w:rPr>
+                <w:sz w:val="19"/>
+                <w:szCs w:val="19"/>
+              </w:rPr>
+              <w:t xml:space="preserve"> no mesmo papel. Papel amarelado, tinta marrom, desenhos a traço. Português arcaico, com latim.</w:t>
             </w:r>
           </w:p>
         </w:tc>
@@ -2549,6 +2587,75 @@
                 <w:szCs w:val="19"/>
               </w:rPr>
               <w:t xml:space="preserve"> (4 páginas).</w:t>
+            </w:r>
+          </w:p>
+        </w:tc>
+      </w:tr>
+      <w:tr>
+        <w:trPr>
+          <w:cantSplit/>
+        </w:trPr>
+        <w:tc>
+          <w:tcPr>
+            <w:tcW w:type="dxa" w:w="2500"/>
+            <w:tcBorders>
+              <w:top w:val="single" w:color="BFC9D1" w:sz="4"/>
+              <w:left w:val="single" w:color="BFC9D1" w:sz="4"/>
+              <w:bottom w:val="single" w:color="BFC9D1" w:sz="4"/>
+              <w:right w:val="single" w:color="BFC9D1" w:sz="4"/>
+            </w:tcBorders>
+            <w:shd w:val="clear" w:color="auto" w:fill="EEF2F5"/>
+            <w:tcMar>
+              <w:top w:type="dxa" w:w="80"/>
+              <w:left w:type="dxa" w:w="120"/>
+              <w:bottom w:type="dxa" w:w="80"/>
+              <w:right w:type="dxa" w:w="120"/>
+            </w:tcMar>
+            <w:vAlign w:val="top"/>
+          </w:tcPr>
+          <w:p>
+            <w:pPr>
+              <w:spacing w:before="0" w:after="0"/>
+            </w:pPr>
+            <w:r>
+              <w:rPr>
+                <w:b/>
+                <w:bCs/>
+                <w:color w:val="1F2A3C"/>
+                <w:sz w:val="19"/>
+                <w:szCs w:val="19"/>
+              </w:rPr>
+              <w:t xml:space="preserve">Cartas</w:t>
+            </w:r>
+          </w:p>
+        </w:tc>
+        <w:tc>
+          <w:tcPr>
+            <w:tcW w:type="dxa" w:w="6526"/>
+            <w:tcBorders>
+              <w:top w:val="single" w:color="BFC9D1" w:sz="4"/>
+              <w:left w:val="single" w:color="BFC9D1" w:sz="4"/>
+              <w:bottom w:val="single" w:color="BFC9D1" w:sz="4"/>
+              <w:right w:val="single" w:color="BFC9D1" w:sz="4"/>
+            </w:tcBorders>
+            <w:tcMar>
+              <w:top w:type="dxa" w:w="80"/>
+              <w:left w:type="dxa" w:w="120"/>
+              <w:bottom w:type="dxa" w:w="80"/>
+              <w:right w:type="dxa" w:w="120"/>
+            </w:tcMar>
+            <w:vAlign w:val="top"/>
+          </w:tcPr>
+          <w:p>
+            <w:pPr>
+              <w:spacing w:before="0" w:after="40"/>
+            </w:pPr>
+            <w:r>
+              <w:rPr>
+                <w:sz w:val="19"/>
+                <w:szCs w:val="19"/>
+              </w:rPr>
+              <w:t xml:space="preserve">escritas para alguém em 1750, que nunca vão chegar. Mudam de tom pelo caminho: medo, curiosidade, coragem. Ainda não escritas.</w:t>
             </w:r>
           </w:p>
         </w:tc>
@@ -3344,7 +3451,7 @@
                 <w:sz w:val="19"/>
                 <w:szCs w:val="19"/>
               </w:rPr>
-              <w:t xml:space="preserve"> (no Labirinto, com a conversa e o gatilho do primeiro encontro).</w:t>
+              <w:t xml:space="preserve"> (no Labirinto, com a conversa e o gatilho do primeiro encontro). Saem do jogo, porque ele não aparece mais em pessoa.</w:t>
             </w:r>
           </w:p>
         </w:tc>
@@ -3594,7 +3701,7 @@
                 <w:sz w:val="19"/>
                 <w:szCs w:val="19"/>
               </w:rPr>
-              <w:t xml:space="preserve">.</w:t>
+              <w:t xml:space="preserve">. Saem do jogo, junto com a cena.</w:t>
             </w:r>
           </w:p>
         </w:tc>
@@ -3635,7 +3742,7 @@
         <w:spacing w:after="60"/>
       </w:pPr>
       <w:r>
-        <w:t xml:space="preserve">O encontro no Labirinto é opcional (a sala é secreta): se ele passa a ser obrigatório, e como o Baltazar sai do esconderijo e se junta ao grupo (Enredo Principal, seção 10.4).</w:t>
+        <w:t xml:space="preserve">A quem ele escreve as cartas em 1750 (Enredo Principal, seção 10.4).</w:t>
       </w:r>
     </w:p>
     <w:p>
@@ -3648,7 +3755,44 @@
         <w:spacing w:after="60"/>
       </w:pPr>
       <w:r>
-        <w:t xml:space="preserve">Gabriel falhando na tela enquanto o Baltazar estiver fora de 1750 (seção 10.4).</w:t>
+        <w:t xml:space="preserve">Escrever as cartas e os rastros de cada fase, e decidir em que fase fica a carta com o anel desenhado (seção 10.5).</w:t>
+      </w:r>
+    </w:p>
+    <w:p>
+      <w:pPr>
+        <w:pStyle w:val="ListParagraph"/>
+        <w:numPr>
+          <w:ilvl w:val="0"/>
+          <w:numId w:val="1"/>
+        </w:numPr>
+        <w:spacing w:after="60"/>
+      </w:pPr>
+      <w:r>
+        <w:t xml:space="preserve">Tirar do jogo o Baltazar em pessoa e os diálogos do Labirinto. O pingente do chapéu, que só aparecia depois de conhecê-lo (</w:t>
+      </w:r>
+      <w:r>
+        <w:rPr>
+          <w:rFonts w:ascii="Consolas" w:hAnsi="Consolas" w:cs="Consolas" w:eastAsia="Consolas"/>
+          <w:color w:val="44505C"/>
+          <w:shd w:val="clear" w:color="auto" w:fill="F1F3F5"/>
+        </w:rPr>
+        <w:t xml:space="preserve">conheceu_baltazar</w:t>
+      </w:r>
+      <w:r>
+        <w:t xml:space="preserve">), precisa de outro gatilho, e a fala do Zane sobre a parede que esquenta "como se tivesse gente" precisa mudar.</w:t>
+      </w:r>
+    </w:p>
+    <w:p>
+      <w:pPr>
+        <w:pStyle w:val="ListParagraph"/>
+        <w:numPr>
+          <w:ilvl w:val="0"/>
+          <w:numId w:val="1"/>
+        </w:numPr>
+        <w:spacing w:after="60"/>
+      </w:pPr>
+      <w:r>
+        <w:t xml:space="preserve">Gabriel falhando na tela enquanto o Baltazar estiver fora de 1750 (seção 10.4): por exemplo, um tremor rápido quando ele lê a última carta.</w:t>
       </w:r>
     </w:p>
     <w:p>

</xml_diff>

<commit_message>
feat: o Labirinto não coloca mais o Baltazar e o pingente aparece com a lanterna
Completa a saída do Baltazar em pessoa (a cena e as conversas já foram
apagadas no commit anterior): o labirinto.gd não instancia mais a cena,
e o pingente 3 passa a esperar esconderijo_baltazar_descoberto.

Co-Authored-By: Claude Opus 5.5 <noreply@anthropic.com>
</commit_message>
<xml_diff>
--- a/docs/historia/personagens/baltazar.docx
+++ b/docs/historia/personagens/baltazar.docx
@@ -3434,7 +3434,7 @@
                 <w:sz w:val="19"/>
                 <w:szCs w:val="19"/>
               </w:rPr>
-              <w:t xml:space="preserve"> (parado) e </w:t>
+              <w:t xml:space="preserve"> (parado). A cena dele no Labirinto (</w:t>
             </w:r>
             <w:r>
               <w:rPr>
@@ -3444,14 +3444,14 @@
                 <w:szCs w:val="19"/>
                 <w:shd w:val="clear" w:color="auto" w:fill="F1F3F5"/>
               </w:rPr>
-              <w:t xml:space="preserve">cenas/personagens/baltazar_no_esconderijo.tscn</w:t>
-            </w:r>
-            <w:r>
-              <w:rPr>
-                <w:sz w:val="19"/>
-                <w:szCs w:val="19"/>
-              </w:rPr>
-              <w:t xml:space="preserve"> (no Labirinto, com a conversa e o gatilho do primeiro encontro). Saem do jogo, porque ele não aparece mais em pessoa.</w:t>
+              <w:t xml:space="preserve">baltazar_no_esconderijo.tscn</w:t>
+            </w:r>
+            <w:r>
+              <w:rPr>
+                <w:sz w:val="19"/>
+                <w:szCs w:val="19"/>
+              </w:rPr>
+              <w:t xml:space="preserve">) saiu do jogo em 2026-10-30, porque ele não aparece mais em pessoa.</w:t>
             </w:r>
           </w:p>
         </w:tc>
@@ -3671,37 +3671,10 @@
             </w:pPr>
             <w:r>
               <w:rPr>
-                <w:rFonts w:ascii="Consolas" w:hAnsi="Consolas" w:cs="Consolas" w:eastAsia="Consolas"/>
-                <w:color w:val="44505C"/>
-                <w:sz w:val="19"/>
-                <w:szCs w:val="19"/>
-                <w:shd w:val="clear" w:color="auto" w:fill="F1F3F5"/>
-              </w:rPr>
-              <w:t xml:space="preserve">dados/dialogos/baltazar_labirinto_primeiro_encontro.json</w:t>
-            </w:r>
-            <w:r>
-              <w:rPr>
-                <w:sz w:val="19"/>
-                <w:szCs w:val="19"/>
-              </w:rPr>
-              <w:t xml:space="preserve"> e </w:t>
-            </w:r>
-            <w:r>
-              <w:rPr>
-                <w:rFonts w:ascii="Consolas" w:hAnsi="Consolas" w:cs="Consolas" w:eastAsia="Consolas"/>
-                <w:color w:val="44505C"/>
-                <w:sz w:val="19"/>
-                <w:szCs w:val="19"/>
-                <w:shd w:val="clear" w:color="auto" w:fill="F1F3F5"/>
-              </w:rPr>
-              <w:t xml:space="preserve">baltazar_labirinto_de_novo.json</w:t>
-            </w:r>
-            <w:r>
-              <w:rPr>
-                <w:sz w:val="19"/>
-                <w:szCs w:val="19"/>
-              </w:rPr>
-              <w:t xml:space="preserve">. Saem do jogo, junto com a cena.</w:t>
+                <w:sz w:val="19"/>
+                <w:szCs w:val="19"/>
+              </w:rPr>
+              <w:t xml:space="preserve">nenhum. As duas conversas do Labirinto saíram do jogo junto com a cena.</w:t>
             </w:r>
           </w:p>
         </w:tc>
@@ -3756,30 +3729,6 @@
       </w:pPr>
       <w:r>
         <w:t xml:space="preserve">Escrever as cartas e os rastros de cada fase, e decidir em que fase fica a carta com o anel desenhado (seção 10.5).</w:t>
-      </w:r>
-    </w:p>
-    <w:p>
-      <w:pPr>
-        <w:pStyle w:val="ListParagraph"/>
-        <w:numPr>
-          <w:ilvl w:val="0"/>
-          <w:numId w:val="1"/>
-        </w:numPr>
-        <w:spacing w:after="60"/>
-      </w:pPr>
-      <w:r>
-        <w:t xml:space="preserve">Tirar do jogo o Baltazar em pessoa e os diálogos do Labirinto. O pingente do chapéu, que só aparecia depois de conhecê-lo (</w:t>
-      </w:r>
-      <w:r>
-        <w:rPr>
-          <w:rFonts w:ascii="Consolas" w:hAnsi="Consolas" w:cs="Consolas" w:eastAsia="Consolas"/>
-          <w:color w:val="44505C"/>
-          <w:shd w:val="clear" w:color="auto" w:fill="F1F3F5"/>
-        </w:rPr>
-        <w:t xml:space="preserve">conheceu_baltazar</w:t>
-      </w:r>
-      <w:r>
-        <w:t xml:space="preserve">), precisa de outro gatilho, e a fala do Zane sobre a parede que esquenta "como se tivesse gente" precisa mudar.</w:t>
       </w:r>
     </w:p>
     <w:p>

</xml_diff>